<commit_message>
docs(forms): retention table + consent split
</commit_message>
<xml_diff>
--- a/docs-forms/03_개인정보동의서.docx
+++ b/docs-forms/03_개인정보동의서.docx
@@ -272,7 +272,7 @@
               <w:rPr>
                 <w:sz w:val="18"/>
               </w:rPr>
-              <w:t>5년 후 파기</w:t>
+              <w:t>예약 종료 즉시 파기</w:t>
             </w:r>
           </w:p>
         </w:tc>
@@ -328,7 +328,185 @@
         <w:pStyle w:val="Heading2"/>
       </w:pPr>
       <w:r>
-        <w:t>2. 보유기간과 파기</w:t>
+        <w:t>2. 법정 보관기간표와 파기</w:t>
+      </w:r>
+    </w:p>
+    <w:p>
+      <w:r>
+        <w:t>거래기록은 전자상거래법 제6조제3항과 같은 법 시행령 제6조제1항에 따라 아래 기간대로 보관합니다.</w:t>
+      </w:r>
+    </w:p>
+    <w:tbl>
+      <w:tblPr>
+        <w:tblStyle w:val="TableGrid"/>
+        <w:tblW w:type="auto" w:w="0"/>
+        <w:jc w:val="center"/>
+        <w:tblLook w:firstColumn="1" w:firstRow="1" w:lastColumn="0" w:lastRow="0" w:noHBand="0" w:noVBand="1" w:val="04A0"/>
+      </w:tblPr>
+      <w:tblGrid>
+        <w:gridCol w:w="4986"/>
+        <w:gridCol w:w="4986"/>
+      </w:tblGrid>
+      <w:tr>
+        <w:tc>
+          <w:tcPr>
+            <w:tcW w:type="dxa" w:w="4986"/>
+          </w:tcPr>
+          <w:p>
+            <w:r/>
+            <w:r>
+              <w:rPr>
+                <w:b/>
+                <w:sz w:val="18"/>
+              </w:rPr>
+              <w:t>기록 유형</w:t>
+            </w:r>
+          </w:p>
+        </w:tc>
+        <w:tc>
+          <w:tcPr>
+            <w:tcW w:type="dxa" w:w="4986"/>
+          </w:tcPr>
+          <w:p>
+            <w:r/>
+            <w:r>
+              <w:rPr>
+                <w:b/>
+                <w:sz w:val="18"/>
+              </w:rPr>
+              <w:t>보관기간</w:t>
+            </w:r>
+          </w:p>
+        </w:tc>
+      </w:tr>
+      <w:tr>
+        <w:tc>
+          <w:tcPr>
+            <w:tcW w:type="dxa" w:w="4986"/>
+          </w:tcPr>
+          <w:p>
+            <w:r/>
+            <w:r>
+              <w:rPr>
+                <w:sz w:val="18"/>
+              </w:rPr>
+              <w:t>표시·광고에 관한 기록</w:t>
+            </w:r>
+          </w:p>
+        </w:tc>
+        <w:tc>
+          <w:tcPr>
+            <w:tcW w:type="dxa" w:w="4986"/>
+          </w:tcPr>
+          <w:p>
+            <w:r/>
+            <w:r>
+              <w:rPr>
+                <w:sz w:val="18"/>
+              </w:rPr>
+              <w:t>6개월</w:t>
+            </w:r>
+          </w:p>
+        </w:tc>
+      </w:tr>
+      <w:tr>
+        <w:tc>
+          <w:tcPr>
+            <w:tcW w:type="dxa" w:w="4986"/>
+          </w:tcPr>
+          <w:p>
+            <w:r/>
+            <w:r>
+              <w:rPr>
+                <w:sz w:val="18"/>
+              </w:rPr>
+              <w:t>계약 또는 청약철회 등에 관한 기록</w:t>
+            </w:r>
+          </w:p>
+        </w:tc>
+        <w:tc>
+          <w:tcPr>
+            <w:tcW w:type="dxa" w:w="4986"/>
+          </w:tcPr>
+          <w:p>
+            <w:r/>
+            <w:r>
+              <w:rPr>
+                <w:sz w:val="18"/>
+              </w:rPr>
+              <w:t>5년</w:t>
+            </w:r>
+          </w:p>
+        </w:tc>
+      </w:tr>
+      <w:tr>
+        <w:tc>
+          <w:tcPr>
+            <w:tcW w:type="dxa" w:w="4986"/>
+          </w:tcPr>
+          <w:p>
+            <w:r/>
+            <w:r>
+              <w:rPr>
+                <w:sz w:val="18"/>
+              </w:rPr>
+              <w:t>대금결제 및 재화등의 공급에 관한 기록</w:t>
+            </w:r>
+          </w:p>
+        </w:tc>
+        <w:tc>
+          <w:tcPr>
+            <w:tcW w:type="dxa" w:w="4986"/>
+          </w:tcPr>
+          <w:p>
+            <w:r/>
+            <w:r>
+              <w:rPr>
+                <w:sz w:val="18"/>
+              </w:rPr>
+              <w:t>5년</w:t>
+            </w:r>
+          </w:p>
+        </w:tc>
+      </w:tr>
+      <w:tr>
+        <w:tc>
+          <w:tcPr>
+            <w:tcW w:type="dxa" w:w="4986"/>
+          </w:tcPr>
+          <w:p>
+            <w:r/>
+            <w:r>
+              <w:rPr>
+                <w:sz w:val="18"/>
+              </w:rPr>
+              <w:t>소비자 불만 또는 분쟁처리에 관한 기록</w:t>
+            </w:r>
+          </w:p>
+        </w:tc>
+        <w:tc>
+          <w:tcPr>
+            <w:tcW w:type="dxa" w:w="4986"/>
+          </w:tcPr>
+          <w:p>
+            <w:r/>
+            <w:r>
+              <w:rPr>
+                <w:sz w:val="18"/>
+              </w:rPr>
+              <w:t>3년</w:t>
+            </w:r>
+          </w:p>
+        </w:tc>
+      </w:tr>
+    </w:tbl>
+    <w:p/>
+    <w:p>
+      <w:pPr>
+        <w:pStyle w:val="ListBullet"/>
+      </w:pPr>
+      <w:r>
+        <w:t>여권사본은 예약 종료 즉시 파기합니다 (개인정보보호법 제21조).</w:t>
       </w:r>
     </w:p>
     <w:p>
@@ -336,7 +514,7 @@
         <w:pStyle w:val="ListBullet"/>
       </w:pPr>
       <w:r>
-        <w:t>보유기간은 전자상거래법 거래기록 기준 5년입니다.</w:t>
+        <w:t>보안코드(CVC)는 어떤 경우에도 저장하지 않습니다 (카드가맹점 표준약관 제19조제2항 보관금지). 카드정보는 직접 수집하지 않고 PG 승인번호만 보관합니다.</w:t>
       </w:r>
     </w:p>
     <w:p>
@@ -344,7 +522,7 @@
         <w:pStyle w:val="ListBullet"/>
       </w:pPr>
       <w:r>
-        <w:t>기간이 끝나면 전자파일은 복구 불가 방식으로 삭제하고 종이서류는 파쇄합니다.</w:t>
+        <w:t>결제·거래내역은 일반 고객DB와 분리 저장하며, 보관기간이 끝나면 전자파일은 복구 불가 방식으로 삭제하고 종이서류는 파쇄합니다.</w:t>
       </w:r>
     </w:p>
     <w:p>
@@ -667,7 +845,15 @@
         <w:pStyle w:val="ListBullet"/>
       </w:pPr>
       <w:r>
-        <w:t>동의를 거부할 수 있으나, 거부 시 예약 알선과 계약 진행이 어렵습니다.</w:t>
+        <w:t>필수동의(예약용)를 거부하면 예약 알선과 계약 진행이 어렵습니다 (개인정보보호법 제15조).</w:t>
+      </w:r>
+    </w:p>
+    <w:p>
+      <w:pPr>
+        <w:pStyle w:val="ListBullet"/>
+      </w:pPr>
+      <w:r>
+        <w:t>선택동의(특가 마케팅용)는 거부해도 예약·계약 진행에 불이익이 없습니다 (개인정보보호법 제22조).</w:t>
       </w:r>
     </w:p>
     <w:p>
@@ -683,7 +869,12 @@
         <w:pStyle w:val="Heading2"/>
       </w:pPr>
       <w:r>
-        <w:t>6. 동의 확인</w:t>
+        <w:t>6. 동의 확인 (필수와 선택 분리)</w:t>
+      </w:r>
+    </w:p>
+    <w:p>
+      <w:r>
+        <w:t>필수동의는 예약용, 선택동의는 특가 마케팅용입니다. 선택동의를 거부해도 서비스 제공에 불이익이 없습니다.</w:t>
       </w:r>
     </w:p>
     <w:tbl>
@@ -740,7 +931,7 @@
               <w:rPr>
                 <w:sz w:val="18"/>
               </w:rPr>
-              <w:t>수집·이용 동의 (성명·연락처·여권정보·비상연락처, 5년)</w:t>
+              <w:t>[필수] 수집·이용 동의 (성명·연락처·여권정보·비상연락처, 법정 보관기간표에 따름)</w:t>
             </w:r>
           </w:p>
         </w:tc>
@@ -770,7 +961,7 @@
               <w:rPr>
                 <w:sz w:val="18"/>
               </w:rPr>
-              <w:t>제3자 제공 동의 (항공사·호텔·골프장·차량·출입국보안당국)</w:t>
+              <w:t>[필수] 제3자 제공 동의 (항공사·호텔·골프장·차량·출입국보안당국)</w:t>
             </w:r>
           </w:p>
         </w:tc>
@@ -800,7 +991,7 @@
               <w:rPr>
                 <w:sz w:val="18"/>
               </w:rPr>
-              <w:t>카드보험 갈음 선택 시 카드사 보험확인용 최소정보 제공 동의</w:t>
+              <w:t>[필수] 카드보험 갈음 선택 시 카드사 보험확인용 최소정보 제공 동의</w:t>
             </w:r>
           </w:p>
         </w:tc>
@@ -830,7 +1021,7 @@
               <w:rPr>
                 <w:sz w:val="18"/>
               </w:rPr>
-              <w:t>정보 안내 수신 동의 (출발 안내·변경 고지 등 계약 이행 고지)</w:t>
+              <w:t>[필수] 정보 안내 수신 동의 (출발 안내·변경 고지 등 계약 이행 고지)</w:t>
             </w:r>
           </w:p>
         </w:tc>
@@ -860,7 +1051,7 @@
               <w:rPr>
                 <w:sz w:val="18"/>
               </w:rPr>
-              <w:t>마케팅(광고) 수신 동의 (별도 동의, 거부해도 계약 진행 가능)</w:t>
+              <w:t>[선택] 특가·마케팅(광고) 수신 동의 (거부해도 예약·계약 진행 가능)</w:t>
             </w:r>
           </w:p>
         </w:tc>

</xml_diff>

<commit_message>
docs(forms): entrust split + transfer fix
</commit_message>
<xml_diff>
--- a/docs-forms/03_개인정보동의서.docx
+++ b/docs-forms/03_개인정보동의서.docx
@@ -824,12 +824,51 @@
         <w:pStyle w:val="Heading2"/>
       </w:pPr>
       <w:r>
+        <w:t>3-2. 제3자제공 vs 처리위탁 구분 안내</w:t>
+      </w:r>
+    </w:p>
+    <w:p>
+      <w:r>
+        <w:t>제3자제공(개인정보보호법 제17조)과 처리위탁(같은 법 제26조)은 다릅니다. 아래 구분에 따라 동의·고지 방식이 달라집니다.</w:t>
+      </w:r>
+    </w:p>
+    <w:p>
+      <w:pPr>
+        <w:pStyle w:val="ListBullet"/>
+      </w:pPr>
+      <w:r>
+        <w:t>제3자제공은 동의 필수입니다(개인정보보호법 제17조). 대상은 항공사·호텔·현지 랜드사·여행자보험사이며, 제공받는 곳이 자기 목적으로 이용하므로 정보주체 동의가 필수입니다. 동의 시 받는 자·이용 목적·제공 항목·보유기간·동의 거부권 5가지를 고지합니다. 위 §3 표의 제공처는 모두 제3자제공에 해당하며, §6 체크박스에서 동의 여부를 표시합니다.</w:t>
+      </w:r>
+    </w:p>
+    <w:p>
+      <w:pPr>
+        <w:pStyle w:val="ListBullet"/>
+      </w:pPr>
+      <w:r>
+        <w:t>처리위탁은 동의가 불필요하고 처리방침 공개로 갈음합니다(개인정보보호법 제26조). 대상은 포트원·PG사(다날)·카카오 알림톡 발송업체·웹호스팅(GitHub)이며, 수탁자는 위탁자인 당사를 대신해 처리만 합니다. 별도 동의는 필요 없으나 처리방침에 위탁업체명을 명시합니다. 단 마케팅성 발송을 위탁하는 경우에는 제26조제3항에 따라 수탁자·위탁내용을 적극 고지합니다.</w:t>
+      </w:r>
+    </w:p>
+    <w:p>
+      <w:r>
+        <w:t>국외 현지 랜드사로 이전이 필요한 경우에는 개인정보보호법 제28조의8(국외이전)에 따라 이전받는 자·국가·항목·목적·보유기간을 별도로 고지하고 동의를 받습니다 (ESTA/eTA 신청 대행 포함).</w:t>
+      </w:r>
+    </w:p>
+    <w:p>
+      <w:r>
+        <w:t>카톡·결제링크 발송 전 체크 순서: 여행약관 동의 → 제3자제공 동의 → 처리방침(위탁업체 명시) 링크 확인 순으로 진행합니다.</w:t>
+      </w:r>
+    </w:p>
+    <w:p>
+      <w:pPr>
+        <w:pStyle w:val="Heading2"/>
+      </w:pPr>
+      <w:r>
         <w:t>4. 국외이전 안내</w:t>
       </w:r>
     </w:p>
     <w:p>
       <w:r>
-        <w:t>수집한 개인정보의 국외이전은 하지 않습니다. 해외 업체 예약은 국내 알선 경유로 처리하며 별도 이전 동의를 받지 않습니다.</w:t>
+        <w:t>원칙적으로 국내에서 처리하며, 현지 랜드사를 통한 예약·ESTA/eTA 신청 대행 등 국외이전이 필요한 경우에는 §3-2에 따라 이전받는 자·국가·항목·목적·보유기간을 별도로 고지하고 동의를 받습니다.</w:t>
       </w:r>
     </w:p>
     <w:p>
@@ -962,6 +1001,36 @@
                 <w:sz w:val="18"/>
               </w:rPr>
               <w:t>[필수] 제3자 제공 동의 (항공사·호텔·골프장·차량·출입국보안당국)</w:t>
+            </w:r>
+          </w:p>
+        </w:tc>
+        <w:tc>
+          <w:tcPr>
+            <w:tcW w:type="dxa" w:w="4986"/>
+          </w:tcPr>
+          <w:p>
+            <w:r/>
+            <w:r>
+              <w:rPr>
+                <w:sz w:val="18"/>
+              </w:rPr>
+              <w:t>□ 동의함  □ 동의하지 않음</w:t>
+            </w:r>
+          </w:p>
+        </w:tc>
+      </w:tr>
+      <w:tr>
+        <w:tc>
+          <w:tcPr>
+            <w:tcW w:type="dxa" w:w="4986"/>
+          </w:tcPr>
+          <w:p>
+            <w:r/>
+            <w:r>
+              <w:rPr>
+                <w:sz w:val="18"/>
+              </w:rPr>
+              <w:t>[필수-해당 시] 국외이전 동의 (현지 랜드사·ESTA/eTA 대행 등, 이전받는 자·국가·항목·목적·보유기간 별도 고지)</w:t>
             </w:r>
           </w:p>
         </w:tc>

</xml_diff>